<commit_message>
Doc ref view feature added and Agent with Evals
</commit_message>
<xml_diff>
--- a/data/borrowing_base_certificates/BBC_Harbor.docx
+++ b/data/borrowing_base_certificates/BBC_Harbor.docx
@@ -154,13 +154,6 @@
           <w:b/>
           <w:bCs/>
         </w:rPr>
-        <w:t>[</w:t>
-      </w:r>
-      <w:r>
-        <w:rPr>
-          <w:b/>
-          <w:bCs/>
-        </w:rPr>
         <w:t>25</w:t>
       </w:r>
       <w:r>
@@ -189,14 +182,14 @@
           <w:b/>
           <w:bCs/>
         </w:rPr>
-        <w:t>2026</w:t>
-      </w:r>
-      <w:r>
-        <w:rPr>
-          <w:b/>
-          <w:bCs/>
-        </w:rPr>
-        <w:t>]</w:t>
+        <w:t>202</w:t>
+      </w:r>
+      <w:r>
+        <w:rPr>
+          <w:b/>
+          <w:bCs/>
+        </w:rPr>
+        <w:t>7</w:t>
       </w:r>
     </w:p>
     <w:p>
@@ -2998,17 +2991,17 @@
           </w:tcPr>
           <w:p>
             <w:r>
-              <w:t>($</w:t>
-            </w:r>
-            <w:r>
-              <w:rPr>
-                <w:b/>
-                <w:bCs/>
-              </w:rPr>
-              <w:t>[________]</w:t>
-            </w:r>
-            <w:r>
-              <w:t>)</w:t>
+              <w:t>$</w:t>
+            </w:r>
+            <w:r>
+              <w:t xml:space="preserve"> </w:t>
+            </w:r>
+            <w:r>
+              <w:rPr>
+                <w:b/>
+                <w:bCs/>
+              </w:rPr>
+              <w:t>12350000</w:t>
             </w:r>
           </w:p>
         </w:tc>
@@ -3911,6 +3904,48 @@
           <w:b/>
           <w:bCs/>
         </w:rPr>
+        <w:t>2</w:t>
+      </w:r>
+      <w:r>
+        <w:rPr>
+          <w:b/>
+          <w:bCs/>
+        </w:rPr>
+        <w:t>5</w:t>
+      </w:r>
+      <w:r>
+        <w:rPr>
+          <w:b/>
+          <w:bCs/>
+        </w:rPr>
+        <w:t>/</w:t>
+      </w:r>
+      <w:r>
+        <w:rPr>
+          <w:b/>
+          <w:bCs/>
+        </w:rPr>
+        <w:t>0</w:t>
+      </w:r>
+      <w:r>
+        <w:rPr>
+          <w:b/>
+          <w:bCs/>
+        </w:rPr>
+        <w:t>8</w:t>
+      </w:r>
+      <w:r>
+        <w:rPr>
+          <w:b/>
+          <w:bCs/>
+        </w:rPr>
+        <w:t>/</w:t>
+      </w:r>
+      <w:r>
+        <w:rPr>
+          <w:b/>
+          <w:bCs/>
+        </w:rPr>
         <w:t>20</w:t>
       </w:r>
       <w:r>
@@ -3918,28 +3953,14 @@
           <w:b/>
           <w:bCs/>
         </w:rPr>
-        <w:t>/</w:t>
-      </w:r>
-      <w:r>
-        <w:rPr>
-          <w:b/>
-          <w:bCs/>
-        </w:rPr>
-        <w:t>05</w:t>
-      </w:r>
-      <w:r>
-        <w:rPr>
-          <w:b/>
-          <w:bCs/>
-        </w:rPr>
-        <w:t>/</w:t>
-      </w:r>
-      <w:r>
-        <w:rPr>
-          <w:b/>
-          <w:bCs/>
-        </w:rPr>
-        <w:t>2026</w:t>
+        <w:t>3</w:t>
+      </w:r>
+      <w:r>
+        <w:rPr>
+          <w:b/>
+          <w:bCs/>
+        </w:rPr>
+        <w:t>0</w:t>
       </w:r>
       <w:r>
         <w:rPr>

</xml_diff>